<commit_message>
Update project report DOCX: embed Chen ER diagram image and full 20-entity relational schema
</commit_message>
<xml_diff>
--- a/DineDesk_Project_Report.docx
+++ b/DineDesk_Project_Report.docx
@@ -1229,147 +1229,48 @@
     </w:p>
     <w:p>
       <w:r>
-        <w:t>The DineDesk database architecture models 9 primary entities connected through foreign-key relationships. Below is the Entity-Relationship structure and cardinality mapping:</w:t>
+        <w:t>The DineDesk database architecture models 20 entities with 25 structural relationships, foreign-key constraints, and cardinalities. Below is the complete Chen-style Entity-Relationship diagram:</w:t>
       </w:r>
     </w:p>
-    <w:tbl>
-      <w:tblPr>
-        <w:tblW w:type="auto" w:w="0"/>
-        <w:jc w:val="center"/>
-        <w:tblLook w:firstColumn="1" w:firstRow="1" w:lastColumn="0" w:lastRow="0" w:noHBand="0" w:noVBand="1" w:val="04A0"/>
-      </w:tblPr>
-      <w:tblGrid>
-        <w:gridCol w:w="9360"/>
-      </w:tblGrid>
-      <w:tr>
-        <w:tc>
-          <w:tcPr>
-            <w:tcW w:type="dxa" w:w="9360"/>
-            <w:shd w:fill="F4F6F9"/>
-            <w:tcMar>
-              <w:top w:w="120" w:type="dxa"/>
-              <w:bottom w:w="120" w:type="dxa"/>
-              <w:left w:w="200" w:type="dxa"/>
-              <w:right w:w="200" w:type="dxa"/>
-            </w:tcMar>
-            <w:tcBorders>
-              <w:left w:val="single" w:sz="18" w:space="0" w:color="102C57"/>
-              <w:top w:val="none"/>
-              <w:right w:val="none"/>
-              <w:bottom w:val="none"/>
-            </w:tcBorders>
-          </w:tcPr>
-          <w:p>
-            <w:pPr>
-              <w:spacing w:before="80" w:after="80" w:line="276" w:lineRule="auto"/>
-            </w:pPr>
-            <w:r>
-              <w:rPr>
-                <w:rFonts w:ascii="Consolas" w:hAnsi="Consolas"/>
-                <w:color w:val="1E1E1E"/>
-                <w:sz w:val="18"/>
-              </w:rPr>
-              <w:br/>
-              <w:t xml:space="preserve">    +-------------------+          +---------------------+          +---------------------+</w:t>
-              <w:br/>
-              <w:t xml:space="preserve">    |    DINING_AREA    | 1      * |    TABLE_ENTITY     | 1      * |     RESERVATION     |</w:t>
-              <w:br/>
-              <w:t xml:space="preserve">    +-------------------+----------+---------------------+----------+---------------------+</w:t>
-              <w:br/>
-              <w:t xml:space="preserve">    | PK: id            |          | PK: id              |          | PK: id              |</w:t>
-              <w:br/>
-              <w:t xml:space="preserve">    |     name          |          | FK: area_id         |          | FK: table_id        |</w:t>
-              <w:br/>
-              <w:t xml:space="preserve">    |     description   |          |     table_number    |          | FK: customer_id     |</w:t>
-              <w:br/>
-              <w:t xml:space="preserve">    |     ambiance_type |          |     capacity        |          |     start_time      |</w:t>
-              <w:br/>
-              <w:t xml:space="preserve">    +-------------------+          |     is_active       |          |     end_time        |</w:t>
-              <w:br/>
-              <w:t xml:space="preserve">                                   +----------+----------+          |     guest_count     |</w:t>
-              <w:br/>
-              <w:t xml:space="preserve">                                              | 1                   |     status          |</w:t>
-              <w:br/>
-              <w:t xml:space="preserve">                                              |                     +----------+----------+</w:t>
-              <w:br/>
-              <w:t xml:space="preserve">                                              | *                              | *</w:t>
-              <w:br/>
-              <w:t xml:space="preserve">                                   +----------+----------+                     |</w:t>
-              <w:br/>
-              <w:t xml:space="preserve">                                   |   DINING_SESSION    |                     |</w:t>
-              <w:br/>
-              <w:t xml:space="preserve">                                   +---------------------+                     |</w:t>
-              <w:br/>
-              <w:t xml:space="preserve">                                   | PK: id              |                     |</w:t>
-              <w:br/>
-              <w:t xml:space="preserve">                                   | FK: table_id        |                     |</w:t>
-              <w:br/>
-              <w:t xml:space="preserve">                                   | FK: customer_id     |                     |</w:t>
-              <w:br/>
-              <w:t xml:space="preserve">                                   |     guest_count     |                     |</w:t>
-              <w:br/>
-              <w:t xml:space="preserve">                                   |     status (ACTIVE) |                     |</w:t>
-              <w:br/>
-              <w:t xml:space="preserve">                                   +----------+----------+                     |</w:t>
-              <w:br/>
-              <w:t xml:space="preserve">                                              | 1                              |</w:t>
-              <w:br/>
-              <w:t xml:space="preserve">                                              |                                |</w:t>
-              <w:br/>
-              <w:t xml:space="preserve">                                              | *                              |</w:t>
-              <w:br/>
-              <w:t xml:space="preserve">                                   +----------+----------+          +----------+----------+</w:t>
-              <w:br/>
-              <w:t xml:space="preserve">                                   |    ORDER_ENTITY     |          |   CUSTOMER_ENTITY   |</w:t>
-              <w:br/>
-              <w:t xml:space="preserve">                                   +---------------------+          +---------------------+</w:t>
-              <w:br/>
-              <w:t xml:space="preserve">                                   | PK: id              |          | PK: id              |</w:t>
-              <w:br/>
-              <w:t xml:space="preserve">                                   | FK: session_id      | 1      * |     first_name      |</w:t>
-              <w:br/>
-              <w:t xml:space="preserve">                                   |     status (PENDING)|----------|     last_name       |</w:t>
-              <w:br/>
-              <w:t xml:space="preserve">                                   |     total_amount    |          |     phone (UNIQUE)  |</w:t>
-              <w:br/>
-              <w:t xml:space="preserve">                                   +----------+----------+          |     email           |</w:t>
-              <w:br/>
-              <w:t xml:space="preserve">                                              | 1                   +---------------------+</w:t>
-              <w:br/>
-              <w:t xml:space="preserve">                                              |</w:t>
-              <w:br/>
-              <w:t xml:space="preserve">                                              | *</w:t>
-              <w:br/>
-              <w:t xml:space="preserve">    +-------------------+ 1      * +----------+----------+</w:t>
-              <w:br/>
-              <w:t xml:space="preserve">    |     MENU_ITEM     |----------|     ORDER_ITEM      |</w:t>
-              <w:br/>
-              <w:t xml:space="preserve">    +-------------------+          +---------------------+</w:t>
-              <w:br/>
-              <w:t xml:space="preserve">    | PK: id            |          | PK: id              |</w:t>
-              <w:br/>
-              <w:t xml:space="preserve">    |     name          |          | FK: order_id        |</w:t>
-              <w:br/>
-              <w:t xml:space="preserve">    |     category      |          | FK: item_id         |</w:t>
-              <w:br/>
-              <w:t xml:space="preserve">    |     price         |          |     quantity        |</w:t>
-              <w:br/>
-              <w:t xml:space="preserve">    |     is_available  |          |     unit_price      |</w:t>
-              <w:br/>
-              <w:t xml:space="preserve">    |     dietary_tags  |          |     special_requests|</w:t>
-              <w:br/>
-              <w:t xml:space="preserve">    +-------------------+          +---------------------+</w:t>
-              <w:br/>
-              <w:t xml:space="preserve">    </w:t>
-            </w:r>
-          </w:p>
-        </w:tc>
-      </w:tr>
-    </w:tbl>
     <w:p>
       <w:pPr>
-        <w:spacing w:after="80"/>
+        <w:spacing w:before="160" w:after="240"/>
+        <w:jc w:val="center"/>
       </w:pPr>
+      <w:r>
+        <w:drawing>
+          <wp:inline xmlns:a="http://schemas.openxmlformats.org/drawingml/2006/main" xmlns:pic="http://schemas.openxmlformats.org/drawingml/2006/picture">
+            <wp:extent cx="5943600" cy="3871466"/>
+            <wp:docPr id="1" name="Picture 1"/>
+            <wp:cNvGraphicFramePr>
+              <a:graphicFrameLocks noChangeAspect="1"/>
+            </wp:cNvGraphicFramePr>
+            <a:graphic>
+              <a:graphicData uri="http://schemas.openxmlformats.org/drawingml/2006/picture">
+                <pic:pic>
+                  <pic:nvPicPr>
+                    <pic:cNvPr id="0" name="dinedesk_chen_er_diagram.png"/>
+                    <pic:cNvPicPr/>
+                  </pic:nvPicPr>
+                  <pic:blipFill>
+                    <a:blip r:embed="rId9"/>
+                    <a:stretch>
+                      <a:fillRect/>
+                    </a:stretch>
+                  </pic:blipFill>
+                  <pic:spPr>
+                    <a:xfrm>
+                      <a:off x="0" y="0"/>
+                      <a:ext cx="5943600" cy="3871466"/>
+                    </a:xfrm>
+                    <a:prstGeom prst="rect"/>
+                  </pic:spPr>
+                </pic:pic>
+              </a:graphicData>
+            </a:graphic>
+          </wp:inline>
+        </w:drawing>
+      </w:r>
     </w:p>
     <w:tbl>
       <w:tblPr>
@@ -1416,7 +1317,7 @@
                 <w:color w:val="FFFFFF"/>
                 <w:sz w:val="19"/>
               </w:rPr>
-              <w:t>Relationship</w:t>
+              <w:t>Rel ID</w:t>
             </w:r>
           </w:p>
         </w:tc>
@@ -1524,7 +1425,7 @@
                 <w:color w:val="FFFFFF"/>
                 <w:sz w:val="19"/>
               </w:rPr>
-              <w:t>Description</w:t>
+              <w:t>Relationship Description</w:t>
             </w:r>
           </w:p>
         </w:tc>
@@ -1576,7 +1477,7 @@
                 <w:color w:val="282828"/>
                 <w:sz w:val="18"/>
               </w:rPr>
-              <w:t>DINING_AREA</w:t>
+              <w:t>BRANCH</w:t>
             </w:r>
           </w:p>
         </w:tc>
@@ -1626,7 +1527,7 @@
                 <w:color w:val="282828"/>
                 <w:sz w:val="18"/>
               </w:rPr>
-              <w:t>TABLE_ENTITY</w:t>
+              <w:t>DINING_AREA</w:t>
             </w:r>
           </w:p>
         </w:tc>
@@ -1651,7 +1552,7 @@
                 <w:color w:val="282828"/>
                 <w:sz w:val="18"/>
               </w:rPr>
-              <w:t>One dining area (Rooftop, Main Hall) contains multiple tables.</w:t>
+              <w:t>One branch contains multiple floor dining areas (Rooftop, Main Hall, Lounge, etc.).</w:t>
             </w:r>
           </w:p>
         </w:tc>
@@ -1703,7 +1604,7 @@
                 <w:color w:val="282828"/>
                 <w:sz w:val="18"/>
               </w:rPr>
-              <w:t>TABLE_ENTITY</w:t>
+              <w:t>DINING_AREA</w:t>
             </w:r>
           </w:p>
         </w:tc>
@@ -1753,7 +1654,7 @@
                 <w:color w:val="282828"/>
                 <w:sz w:val="18"/>
               </w:rPr>
-              <w:t>RESERVATION</w:t>
+              <w:t>TABLE_ENTITY</w:t>
             </w:r>
           </w:p>
         </w:tc>
@@ -1778,7 +1679,7 @@
                 <w:color w:val="282828"/>
                 <w:sz w:val="18"/>
               </w:rPr>
-              <w:t>A single physical table can have multiple sequential time-slot bookings.</w:t>
+              <w:t>Each dining area encompasses multiple dining tables.</w:t>
             </w:r>
           </w:p>
         </w:tc>
@@ -1830,7 +1731,7 @@
                 <w:color w:val="282828"/>
                 <w:sz w:val="18"/>
               </w:rPr>
-              <w:t>CUSTOMER_ENTITY</w:t>
+              <w:t>BRANCH</w:t>
             </w:r>
           </w:p>
         </w:tc>
@@ -1880,7 +1781,7 @@
                 <w:color w:val="282828"/>
                 <w:sz w:val="18"/>
               </w:rPr>
-              <w:t>RESERVATION</w:t>
+              <w:t>USER_ACCOUNT</w:t>
             </w:r>
           </w:p>
         </w:tc>
@@ -1905,7 +1806,7 @@
                 <w:color w:val="282828"/>
                 <w:sz w:val="18"/>
               </w:rPr>
-              <w:t>A registered customer can place multiple table reservations.</w:t>
+              <w:t>Each branch employs staff members and administrative personnel.</w:t>
             </w:r>
           </w:p>
         </w:tc>
@@ -1957,7 +1858,7 @@
                 <w:color w:val="282828"/>
                 <w:sz w:val="18"/>
               </w:rPr>
-              <w:t>TABLE_ENTITY</w:t>
+              <w:t>ROLE</w:t>
             </w:r>
           </w:p>
         </w:tc>
@@ -2007,7 +1908,7 @@
                 <w:color w:val="282828"/>
                 <w:sz w:val="18"/>
               </w:rPr>
-              <w:t>DINING_SESSION</w:t>
+              <w:t>USER_ACCOUNT</w:t>
             </w:r>
           </w:p>
         </w:tc>
@@ -2032,7 +1933,7 @@
                 <w:color w:val="282828"/>
                 <w:sz w:val="18"/>
               </w:rPr>
-              <w:t>A table hosts multiple live seated customer dining sessions over time.</w:t>
+              <w:t>Access roles (Admin, Waiter, Chef, Cashier) assigned to accounts.</w:t>
             </w:r>
           </w:p>
         </w:tc>
@@ -2084,7 +1985,7 @@
                 <w:color w:val="282828"/>
                 <w:sz w:val="18"/>
               </w:rPr>
-              <w:t>DINING_SESSION</w:t>
+              <w:t>TABLE_ENTITY</w:t>
             </w:r>
           </w:p>
         </w:tc>
@@ -2134,7 +2035,7 @@
                 <w:color w:val="282828"/>
                 <w:sz w:val="18"/>
               </w:rPr>
-              <w:t>ORDER_ENTITY</w:t>
+              <w:t>RESERVATION</w:t>
             </w:r>
           </w:p>
         </w:tc>
@@ -2159,7 +2060,7 @@
                 <w:color w:val="282828"/>
                 <w:sz w:val="18"/>
               </w:rPr>
-              <w:t>A dining session can submit multiple order rounds to the kitchen.</w:t>
+              <w:t>A physical dining table hosts multiple sequential reservation slots.</w:t>
             </w:r>
           </w:p>
         </w:tc>
@@ -2211,7 +2112,7 @@
                 <w:color w:val="282828"/>
                 <w:sz w:val="18"/>
               </w:rPr>
-              <w:t>ORDER_ENTITY</w:t>
+              <w:t>CUSTOMER</w:t>
             </w:r>
           </w:p>
         </w:tc>
@@ -2261,7 +2162,7 @@
                 <w:color w:val="282828"/>
                 <w:sz w:val="18"/>
               </w:rPr>
-              <w:t>ORDER_ITEM</w:t>
+              <w:t>RESERVATION</w:t>
             </w:r>
           </w:p>
         </w:tc>
@@ -2286,7 +2187,7 @@
                 <w:color w:val="282828"/>
                 <w:sz w:val="18"/>
               </w:rPr>
-              <w:t>Each order contains multiple distinct dish line items.</w:t>
+              <w:t>A registered patron books one or more advance table reservations.</w:t>
             </w:r>
           </w:p>
         </w:tc>
@@ -2338,7 +2239,7 @@
                 <w:color w:val="282828"/>
                 <w:sz w:val="18"/>
               </w:rPr>
-              <w:t>MENU_ITEM</w:t>
+              <w:t>TABLE_ENTITY</w:t>
             </w:r>
           </w:p>
         </w:tc>
@@ -2388,7 +2289,7 @@
                 <w:color w:val="282828"/>
                 <w:sz w:val="18"/>
               </w:rPr>
-              <w:t>ORDER_ITEM</w:t>
+              <w:t>DINING_SESSION</w:t>
             </w:r>
           </w:p>
         </w:tc>
@@ -2413,7 +2314,7 @@
                 <w:color w:val="282828"/>
                 <w:sz w:val="18"/>
               </w:rPr>
-              <w:t>A menu item can appear across numerous customer order line items.</w:t>
+              <w:t>A dining table hosts active live customer dining sessions over time.</w:t>
             </w:r>
           </w:p>
         </w:tc>
@@ -2465,7 +2366,7 @@
                 <w:color w:val="282828"/>
                 <w:sz w:val="18"/>
               </w:rPr>
-              <w:t>DINING_SESSION</w:t>
+              <w:t>CUSTOMER</w:t>
             </w:r>
           </w:p>
         </w:tc>
@@ -2490,7 +2391,7 @@
                 <w:color w:val="282828"/>
                 <w:sz w:val="18"/>
               </w:rPr>
-              <w:t>1 : 1</w:t>
+              <w:t>1 : N</w:t>
             </w:r>
           </w:p>
         </w:tc>
@@ -2515,7 +2416,7 @@
                 <w:color w:val="282828"/>
                 <w:sz w:val="18"/>
               </w:rPr>
-              <w:t>BILL_ENTITY</w:t>
+              <w:t>DINING_SESSION</w:t>
             </w:r>
           </w:p>
         </w:tc>
@@ -2540,7 +2441,7 @@
                 <w:color w:val="282828"/>
                 <w:sz w:val="18"/>
               </w:rPr>
-              <w:t>Each completed dining session generates a single finalized invoice.</w:t>
+              <w:t>A customer attends and participates in a live dining session.</w:t>
             </w:r>
           </w:p>
         </w:tc>
@@ -2592,7 +2493,7 @@
                 <w:color w:val="282828"/>
                 <w:sz w:val="18"/>
               </w:rPr>
-              <w:t>BILL_ENTITY</w:t>
+              <w:t>RESERVATION</w:t>
             </w:r>
           </w:p>
         </w:tc>
@@ -2617,7 +2518,7 @@
                 <w:color w:val="282828"/>
                 <w:sz w:val="18"/>
               </w:rPr>
-              <w:t>1 : N</w:t>
+              <w:t>1 : 1</w:t>
             </w:r>
           </w:p>
         </w:tc>
@@ -2642,7 +2543,7 @@
                 <w:color w:val="282828"/>
                 <w:sz w:val="18"/>
               </w:rPr>
-              <w:t>PAYMENT_RECORD</w:t>
+              <w:t>DINING_SESSION</w:t>
             </w:r>
           </w:p>
         </w:tc>
@@ -2667,7 +2568,2039 @@
                 <w:color w:val="282828"/>
                 <w:sz w:val="18"/>
               </w:rPr>
-              <w:t>A bill can be settled through single or split payment records.</w:t>
+              <w:t>A confirmed reservation is fulfilled by seating into an active dining session.</w:t>
+            </w:r>
+          </w:p>
+        </w:tc>
+      </w:tr>
+      <w:tr>
+        <w:tc>
+          <w:tcPr>
+            <w:tcW w:type="dxa" w:w="1872"/>
+            <w:shd w:fill="F9FAFC"/>
+            <w:tcMar>
+              <w:top w:w="80" w:type="dxa"/>
+              <w:bottom w:w="80" w:type="dxa"/>
+              <w:left w:w="140" w:type="dxa"/>
+              <w:right w:w="140" w:type="dxa"/>
+            </w:tcMar>
+          </w:tcPr>
+          <w:p>
+            <w:pPr>
+              <w:spacing w:before="40" w:after="40"/>
+            </w:pPr>
+            <w:r>
+              <w:rPr>
+                <w:rFonts w:ascii="Calibri" w:hAnsi="Calibri"/>
+                <w:color w:val="282828"/>
+                <w:sz w:val="18"/>
+              </w:rPr>
+              <w:t>R10</w:t>
+            </w:r>
+          </w:p>
+        </w:tc>
+        <w:tc>
+          <w:tcPr>
+            <w:tcW w:type="dxa" w:w="1872"/>
+            <w:shd w:fill="F9FAFC"/>
+            <w:tcMar>
+              <w:top w:w="80" w:type="dxa"/>
+              <w:bottom w:w="80" w:type="dxa"/>
+              <w:left w:w="140" w:type="dxa"/>
+              <w:right w:w="140" w:type="dxa"/>
+            </w:tcMar>
+          </w:tcPr>
+          <w:p>
+            <w:pPr>
+              <w:spacing w:before="40" w:after="40"/>
+            </w:pPr>
+            <w:r>
+              <w:rPr>
+                <w:rFonts w:ascii="Calibri" w:hAnsi="Calibri"/>
+                <w:color w:val="282828"/>
+                <w:sz w:val="18"/>
+              </w:rPr>
+              <w:t>MENU_CATEGORY</w:t>
+            </w:r>
+          </w:p>
+        </w:tc>
+        <w:tc>
+          <w:tcPr>
+            <w:tcW w:type="dxa" w:w="1872"/>
+            <w:shd w:fill="F9FAFC"/>
+            <w:tcMar>
+              <w:top w:w="80" w:type="dxa"/>
+              <w:bottom w:w="80" w:type="dxa"/>
+              <w:left w:w="140" w:type="dxa"/>
+              <w:right w:w="140" w:type="dxa"/>
+            </w:tcMar>
+          </w:tcPr>
+          <w:p>
+            <w:pPr>
+              <w:spacing w:before="40" w:after="40"/>
+            </w:pPr>
+            <w:r>
+              <w:rPr>
+                <w:rFonts w:ascii="Calibri" w:hAnsi="Calibri"/>
+                <w:color w:val="282828"/>
+                <w:sz w:val="18"/>
+              </w:rPr>
+              <w:t>1 : N</w:t>
+            </w:r>
+          </w:p>
+        </w:tc>
+        <w:tc>
+          <w:tcPr>
+            <w:tcW w:type="dxa" w:w="1872"/>
+            <w:shd w:fill="F9FAFC"/>
+            <w:tcMar>
+              <w:top w:w="80" w:type="dxa"/>
+              <w:bottom w:w="80" w:type="dxa"/>
+              <w:left w:w="140" w:type="dxa"/>
+              <w:right w:w="140" w:type="dxa"/>
+            </w:tcMar>
+          </w:tcPr>
+          <w:p>
+            <w:pPr>
+              <w:spacing w:before="40" w:after="40"/>
+            </w:pPr>
+            <w:r>
+              <w:rPr>
+                <w:rFonts w:ascii="Calibri" w:hAnsi="Calibri"/>
+                <w:color w:val="282828"/>
+                <w:sz w:val="18"/>
+              </w:rPr>
+              <w:t>MENU_ITEM</w:t>
+            </w:r>
+          </w:p>
+        </w:tc>
+        <w:tc>
+          <w:tcPr>
+            <w:tcW w:type="dxa" w:w="1872"/>
+            <w:shd w:fill="F9FAFC"/>
+            <w:tcMar>
+              <w:top w:w="80" w:type="dxa"/>
+              <w:bottom w:w="80" w:type="dxa"/>
+              <w:left w:w="140" w:type="dxa"/>
+              <w:right w:w="140" w:type="dxa"/>
+            </w:tcMar>
+          </w:tcPr>
+          <w:p>
+            <w:pPr>
+              <w:spacing w:before="40" w:after="40"/>
+            </w:pPr>
+            <w:r>
+              <w:rPr>
+                <w:rFonts w:ascii="Calibri" w:hAnsi="Calibri"/>
+                <w:color w:val="282828"/>
+                <w:sz w:val="18"/>
+              </w:rPr>
+              <w:t>Each food category categorizes multiple distinct culinary dishes.</w:t>
+            </w:r>
+          </w:p>
+        </w:tc>
+      </w:tr>
+      <w:tr>
+        <w:tc>
+          <w:tcPr>
+            <w:tcW w:type="dxa" w:w="1872"/>
+            <w:shd w:fill="FFFFFF"/>
+            <w:tcMar>
+              <w:top w:w="80" w:type="dxa"/>
+              <w:bottom w:w="80" w:type="dxa"/>
+              <w:left w:w="140" w:type="dxa"/>
+              <w:right w:w="140" w:type="dxa"/>
+            </w:tcMar>
+          </w:tcPr>
+          <w:p>
+            <w:pPr>
+              <w:spacing w:before="40" w:after="40"/>
+            </w:pPr>
+            <w:r>
+              <w:rPr>
+                <w:rFonts w:ascii="Calibri" w:hAnsi="Calibri"/>
+                <w:color w:val="282828"/>
+                <w:sz w:val="18"/>
+              </w:rPr>
+              <w:t>R11</w:t>
+            </w:r>
+          </w:p>
+        </w:tc>
+        <w:tc>
+          <w:tcPr>
+            <w:tcW w:type="dxa" w:w="1872"/>
+            <w:shd w:fill="FFFFFF"/>
+            <w:tcMar>
+              <w:top w:w="80" w:type="dxa"/>
+              <w:bottom w:w="80" w:type="dxa"/>
+              <w:left w:w="140" w:type="dxa"/>
+              <w:right w:w="140" w:type="dxa"/>
+            </w:tcMar>
+          </w:tcPr>
+          <w:p>
+            <w:pPr>
+              <w:spacing w:before="40" w:after="40"/>
+            </w:pPr>
+            <w:r>
+              <w:rPr>
+                <w:rFonts w:ascii="Calibri" w:hAnsi="Calibri"/>
+                <w:color w:val="282828"/>
+                <w:sz w:val="18"/>
+              </w:rPr>
+              <w:t>DINING_SESSION</w:t>
+            </w:r>
+          </w:p>
+        </w:tc>
+        <w:tc>
+          <w:tcPr>
+            <w:tcW w:type="dxa" w:w="1872"/>
+            <w:shd w:fill="FFFFFF"/>
+            <w:tcMar>
+              <w:top w:w="80" w:type="dxa"/>
+              <w:bottom w:w="80" w:type="dxa"/>
+              <w:left w:w="140" w:type="dxa"/>
+              <w:right w:w="140" w:type="dxa"/>
+            </w:tcMar>
+          </w:tcPr>
+          <w:p>
+            <w:pPr>
+              <w:spacing w:before="40" w:after="40"/>
+            </w:pPr>
+            <w:r>
+              <w:rPr>
+                <w:rFonts w:ascii="Calibri" w:hAnsi="Calibri"/>
+                <w:color w:val="282828"/>
+                <w:sz w:val="18"/>
+              </w:rPr>
+              <w:t>1 : N</w:t>
+            </w:r>
+          </w:p>
+        </w:tc>
+        <w:tc>
+          <w:tcPr>
+            <w:tcW w:type="dxa" w:w="1872"/>
+            <w:shd w:fill="FFFFFF"/>
+            <w:tcMar>
+              <w:top w:w="80" w:type="dxa"/>
+              <w:bottom w:w="80" w:type="dxa"/>
+              <w:left w:w="140" w:type="dxa"/>
+              <w:right w:w="140" w:type="dxa"/>
+            </w:tcMar>
+          </w:tcPr>
+          <w:p>
+            <w:pPr>
+              <w:spacing w:before="40" w:after="40"/>
+            </w:pPr>
+            <w:r>
+              <w:rPr>
+                <w:rFonts w:ascii="Calibri" w:hAnsi="Calibri"/>
+                <w:color w:val="282828"/>
+                <w:sz w:val="18"/>
+              </w:rPr>
+              <w:t>CUSTOMER_ORDER</w:t>
+            </w:r>
+          </w:p>
+        </w:tc>
+        <w:tc>
+          <w:tcPr>
+            <w:tcW w:type="dxa" w:w="1872"/>
+            <w:shd w:fill="FFFFFF"/>
+            <w:tcMar>
+              <w:top w:w="80" w:type="dxa"/>
+              <w:bottom w:w="80" w:type="dxa"/>
+              <w:left w:w="140" w:type="dxa"/>
+              <w:right w:w="140" w:type="dxa"/>
+            </w:tcMar>
+          </w:tcPr>
+          <w:p>
+            <w:pPr>
+              <w:spacing w:before="40" w:after="40"/>
+            </w:pPr>
+            <w:r>
+              <w:rPr>
+                <w:rFonts w:ascii="Calibri" w:hAnsi="Calibri"/>
+                <w:color w:val="282828"/>
+                <w:sz w:val="18"/>
+              </w:rPr>
+              <w:t>An active table session places multiple order rounds during their stay.</w:t>
+            </w:r>
+          </w:p>
+        </w:tc>
+      </w:tr>
+      <w:tr>
+        <w:tc>
+          <w:tcPr>
+            <w:tcW w:type="dxa" w:w="1872"/>
+            <w:shd w:fill="F9FAFC"/>
+            <w:tcMar>
+              <w:top w:w="80" w:type="dxa"/>
+              <w:bottom w:w="80" w:type="dxa"/>
+              <w:left w:w="140" w:type="dxa"/>
+              <w:right w:w="140" w:type="dxa"/>
+            </w:tcMar>
+          </w:tcPr>
+          <w:p>
+            <w:pPr>
+              <w:spacing w:before="40" w:after="40"/>
+            </w:pPr>
+            <w:r>
+              <w:rPr>
+                <w:rFonts w:ascii="Calibri" w:hAnsi="Calibri"/>
+                <w:color w:val="282828"/>
+                <w:sz w:val="18"/>
+              </w:rPr>
+              <w:t>R12</w:t>
+            </w:r>
+          </w:p>
+        </w:tc>
+        <w:tc>
+          <w:tcPr>
+            <w:tcW w:type="dxa" w:w="1872"/>
+            <w:shd w:fill="F9FAFC"/>
+            <w:tcMar>
+              <w:top w:w="80" w:type="dxa"/>
+              <w:bottom w:w="80" w:type="dxa"/>
+              <w:left w:w="140" w:type="dxa"/>
+              <w:right w:w="140" w:type="dxa"/>
+            </w:tcMar>
+          </w:tcPr>
+          <w:p>
+            <w:pPr>
+              <w:spacing w:before="40" w:after="40"/>
+            </w:pPr>
+            <w:r>
+              <w:rPr>
+                <w:rFonts w:ascii="Calibri" w:hAnsi="Calibri"/>
+                <w:color w:val="282828"/>
+                <w:sz w:val="18"/>
+              </w:rPr>
+              <w:t>USER_ACCOUNT</w:t>
+            </w:r>
+          </w:p>
+        </w:tc>
+        <w:tc>
+          <w:tcPr>
+            <w:tcW w:type="dxa" w:w="1872"/>
+            <w:shd w:fill="F9FAFC"/>
+            <w:tcMar>
+              <w:top w:w="80" w:type="dxa"/>
+              <w:bottom w:w="80" w:type="dxa"/>
+              <w:left w:w="140" w:type="dxa"/>
+              <w:right w:w="140" w:type="dxa"/>
+            </w:tcMar>
+          </w:tcPr>
+          <w:p>
+            <w:pPr>
+              <w:spacing w:before="40" w:after="40"/>
+            </w:pPr>
+            <w:r>
+              <w:rPr>
+                <w:rFonts w:ascii="Calibri" w:hAnsi="Calibri"/>
+                <w:color w:val="282828"/>
+                <w:sz w:val="18"/>
+              </w:rPr>
+              <w:t>1 : N</w:t>
+            </w:r>
+          </w:p>
+        </w:tc>
+        <w:tc>
+          <w:tcPr>
+            <w:tcW w:type="dxa" w:w="1872"/>
+            <w:shd w:fill="F9FAFC"/>
+            <w:tcMar>
+              <w:top w:w="80" w:type="dxa"/>
+              <w:bottom w:w="80" w:type="dxa"/>
+              <w:left w:w="140" w:type="dxa"/>
+              <w:right w:w="140" w:type="dxa"/>
+            </w:tcMar>
+          </w:tcPr>
+          <w:p>
+            <w:pPr>
+              <w:spacing w:before="40" w:after="40"/>
+            </w:pPr>
+            <w:r>
+              <w:rPr>
+                <w:rFonts w:ascii="Calibri" w:hAnsi="Calibri"/>
+                <w:color w:val="282828"/>
+                <w:sz w:val="18"/>
+              </w:rPr>
+              <w:t>CUSTOMER_ORDER</w:t>
+            </w:r>
+          </w:p>
+        </w:tc>
+        <w:tc>
+          <w:tcPr>
+            <w:tcW w:type="dxa" w:w="1872"/>
+            <w:shd w:fill="F9FAFC"/>
+            <w:tcMar>
+              <w:top w:w="80" w:type="dxa"/>
+              <w:bottom w:w="80" w:type="dxa"/>
+              <w:left w:w="140" w:type="dxa"/>
+              <w:right w:w="140" w:type="dxa"/>
+            </w:tcMar>
+          </w:tcPr>
+          <w:p>
+            <w:pPr>
+              <w:spacing w:before="40" w:after="40"/>
+            </w:pPr>
+            <w:r>
+              <w:rPr>
+                <w:rFonts w:ascii="Calibri" w:hAnsi="Calibri"/>
+                <w:color w:val="282828"/>
+                <w:sz w:val="18"/>
+              </w:rPr>
+              <w:t>A staff user / server takes and routes the customer order.</w:t>
+            </w:r>
+          </w:p>
+        </w:tc>
+      </w:tr>
+      <w:tr>
+        <w:tc>
+          <w:tcPr>
+            <w:tcW w:type="dxa" w:w="1872"/>
+            <w:shd w:fill="FFFFFF"/>
+            <w:tcMar>
+              <w:top w:w="80" w:type="dxa"/>
+              <w:bottom w:w="80" w:type="dxa"/>
+              <w:left w:w="140" w:type="dxa"/>
+              <w:right w:w="140" w:type="dxa"/>
+            </w:tcMar>
+          </w:tcPr>
+          <w:p>
+            <w:pPr>
+              <w:spacing w:before="40" w:after="40"/>
+            </w:pPr>
+            <w:r>
+              <w:rPr>
+                <w:rFonts w:ascii="Calibri" w:hAnsi="Calibri"/>
+                <w:color w:val="282828"/>
+                <w:sz w:val="18"/>
+              </w:rPr>
+              <w:t>R13</w:t>
+            </w:r>
+          </w:p>
+        </w:tc>
+        <w:tc>
+          <w:tcPr>
+            <w:tcW w:type="dxa" w:w="1872"/>
+            <w:shd w:fill="FFFFFF"/>
+            <w:tcMar>
+              <w:top w:w="80" w:type="dxa"/>
+              <w:bottom w:w="80" w:type="dxa"/>
+              <w:left w:w="140" w:type="dxa"/>
+              <w:right w:w="140" w:type="dxa"/>
+            </w:tcMar>
+          </w:tcPr>
+          <w:p>
+            <w:pPr>
+              <w:spacing w:before="40" w:after="40"/>
+            </w:pPr>
+            <w:r>
+              <w:rPr>
+                <w:rFonts w:ascii="Calibri" w:hAnsi="Calibri"/>
+                <w:color w:val="282828"/>
+                <w:sz w:val="18"/>
+              </w:rPr>
+              <w:t>CUSTOMER_ORDER</w:t>
+            </w:r>
+          </w:p>
+        </w:tc>
+        <w:tc>
+          <w:tcPr>
+            <w:tcW w:type="dxa" w:w="1872"/>
+            <w:shd w:fill="FFFFFF"/>
+            <w:tcMar>
+              <w:top w:w="80" w:type="dxa"/>
+              <w:bottom w:w="80" w:type="dxa"/>
+              <w:left w:w="140" w:type="dxa"/>
+              <w:right w:w="140" w:type="dxa"/>
+            </w:tcMar>
+          </w:tcPr>
+          <w:p>
+            <w:pPr>
+              <w:spacing w:before="40" w:after="40"/>
+            </w:pPr>
+            <w:r>
+              <w:rPr>
+                <w:rFonts w:ascii="Calibri" w:hAnsi="Calibri"/>
+                <w:color w:val="282828"/>
+                <w:sz w:val="18"/>
+              </w:rPr>
+              <w:t>1 : N</w:t>
+            </w:r>
+          </w:p>
+        </w:tc>
+        <w:tc>
+          <w:tcPr>
+            <w:tcW w:type="dxa" w:w="1872"/>
+            <w:shd w:fill="FFFFFF"/>
+            <w:tcMar>
+              <w:top w:w="80" w:type="dxa"/>
+              <w:bottom w:w="80" w:type="dxa"/>
+              <w:left w:w="140" w:type="dxa"/>
+              <w:right w:w="140" w:type="dxa"/>
+            </w:tcMar>
+          </w:tcPr>
+          <w:p>
+            <w:pPr>
+              <w:spacing w:before="40" w:after="40"/>
+            </w:pPr>
+            <w:r>
+              <w:rPr>
+                <w:rFonts w:ascii="Calibri" w:hAnsi="Calibri"/>
+                <w:color w:val="282828"/>
+                <w:sz w:val="18"/>
+              </w:rPr>
+              <w:t>ORDER_ITEM</w:t>
+            </w:r>
+          </w:p>
+        </w:tc>
+        <w:tc>
+          <w:tcPr>
+            <w:tcW w:type="dxa" w:w="1872"/>
+            <w:shd w:fill="FFFFFF"/>
+            <w:tcMar>
+              <w:top w:w="80" w:type="dxa"/>
+              <w:bottom w:w="80" w:type="dxa"/>
+              <w:left w:w="140" w:type="dxa"/>
+              <w:right w:w="140" w:type="dxa"/>
+            </w:tcMar>
+          </w:tcPr>
+          <w:p>
+            <w:pPr>
+              <w:spacing w:before="40" w:after="40"/>
+            </w:pPr>
+            <w:r>
+              <w:rPr>
+                <w:rFonts w:ascii="Calibri" w:hAnsi="Calibri"/>
+                <w:color w:val="282828"/>
+                <w:sz w:val="18"/>
+              </w:rPr>
+              <w:t>Each order ticket includes itemized food lines with quantities.</w:t>
+            </w:r>
+          </w:p>
+        </w:tc>
+      </w:tr>
+      <w:tr>
+        <w:tc>
+          <w:tcPr>
+            <w:tcW w:type="dxa" w:w="1872"/>
+            <w:shd w:fill="F9FAFC"/>
+            <w:tcMar>
+              <w:top w:w="80" w:type="dxa"/>
+              <w:bottom w:w="80" w:type="dxa"/>
+              <w:left w:w="140" w:type="dxa"/>
+              <w:right w:w="140" w:type="dxa"/>
+            </w:tcMar>
+          </w:tcPr>
+          <w:p>
+            <w:pPr>
+              <w:spacing w:before="40" w:after="40"/>
+            </w:pPr>
+            <w:r>
+              <w:rPr>
+                <w:rFonts w:ascii="Calibri" w:hAnsi="Calibri"/>
+                <w:color w:val="282828"/>
+                <w:sz w:val="18"/>
+              </w:rPr>
+              <w:t>R14</w:t>
+            </w:r>
+          </w:p>
+        </w:tc>
+        <w:tc>
+          <w:tcPr>
+            <w:tcW w:type="dxa" w:w="1872"/>
+            <w:shd w:fill="F9FAFC"/>
+            <w:tcMar>
+              <w:top w:w="80" w:type="dxa"/>
+              <w:bottom w:w="80" w:type="dxa"/>
+              <w:left w:w="140" w:type="dxa"/>
+              <w:right w:w="140" w:type="dxa"/>
+            </w:tcMar>
+          </w:tcPr>
+          <w:p>
+            <w:pPr>
+              <w:spacing w:before="40" w:after="40"/>
+            </w:pPr>
+            <w:r>
+              <w:rPr>
+                <w:rFonts w:ascii="Calibri" w:hAnsi="Calibri"/>
+                <w:color w:val="282828"/>
+                <w:sz w:val="18"/>
+              </w:rPr>
+              <w:t>MENU_ITEM</w:t>
+            </w:r>
+          </w:p>
+        </w:tc>
+        <w:tc>
+          <w:tcPr>
+            <w:tcW w:type="dxa" w:w="1872"/>
+            <w:shd w:fill="F9FAFC"/>
+            <w:tcMar>
+              <w:top w:w="80" w:type="dxa"/>
+              <w:bottom w:w="80" w:type="dxa"/>
+              <w:left w:w="140" w:type="dxa"/>
+              <w:right w:w="140" w:type="dxa"/>
+            </w:tcMar>
+          </w:tcPr>
+          <w:p>
+            <w:pPr>
+              <w:spacing w:before="40" w:after="40"/>
+            </w:pPr>
+            <w:r>
+              <w:rPr>
+                <w:rFonts w:ascii="Calibri" w:hAnsi="Calibri"/>
+                <w:color w:val="282828"/>
+                <w:sz w:val="18"/>
+              </w:rPr>
+              <w:t>1 : N</w:t>
+            </w:r>
+          </w:p>
+        </w:tc>
+        <w:tc>
+          <w:tcPr>
+            <w:tcW w:type="dxa" w:w="1872"/>
+            <w:shd w:fill="F9FAFC"/>
+            <w:tcMar>
+              <w:top w:w="80" w:type="dxa"/>
+              <w:bottom w:w="80" w:type="dxa"/>
+              <w:left w:w="140" w:type="dxa"/>
+              <w:right w:w="140" w:type="dxa"/>
+            </w:tcMar>
+          </w:tcPr>
+          <w:p>
+            <w:pPr>
+              <w:spacing w:before="40" w:after="40"/>
+            </w:pPr>
+            <w:r>
+              <w:rPr>
+                <w:rFonts w:ascii="Calibri" w:hAnsi="Calibri"/>
+                <w:color w:val="282828"/>
+                <w:sz w:val="18"/>
+              </w:rPr>
+              <w:t>ORDER_ITEM</w:t>
+            </w:r>
+          </w:p>
+        </w:tc>
+        <w:tc>
+          <w:tcPr>
+            <w:tcW w:type="dxa" w:w="1872"/>
+            <w:shd w:fill="F9FAFC"/>
+            <w:tcMar>
+              <w:top w:w="80" w:type="dxa"/>
+              <w:bottom w:w="80" w:type="dxa"/>
+              <w:left w:w="140" w:type="dxa"/>
+              <w:right w:w="140" w:type="dxa"/>
+            </w:tcMar>
+          </w:tcPr>
+          <w:p>
+            <w:pPr>
+              <w:spacing w:before="40" w:after="40"/>
+            </w:pPr>
+            <w:r>
+              <w:rPr>
+                <w:rFonts w:ascii="Calibri" w:hAnsi="Calibri"/>
+                <w:color w:val="282828"/>
+                <w:sz w:val="18"/>
+              </w:rPr>
+              <w:t>Menu items appear across customer order items.</w:t>
+            </w:r>
+          </w:p>
+        </w:tc>
+      </w:tr>
+      <w:tr>
+        <w:tc>
+          <w:tcPr>
+            <w:tcW w:type="dxa" w:w="1872"/>
+            <w:shd w:fill="FFFFFF"/>
+            <w:tcMar>
+              <w:top w:w="80" w:type="dxa"/>
+              <w:bottom w:w="80" w:type="dxa"/>
+              <w:left w:w="140" w:type="dxa"/>
+              <w:right w:w="140" w:type="dxa"/>
+            </w:tcMar>
+          </w:tcPr>
+          <w:p>
+            <w:pPr>
+              <w:spacing w:before="40" w:after="40"/>
+            </w:pPr>
+            <w:r>
+              <w:rPr>
+                <w:rFonts w:ascii="Calibri" w:hAnsi="Calibri"/>
+                <w:color w:val="282828"/>
+                <w:sz w:val="18"/>
+              </w:rPr>
+              <w:t>R15</w:t>
+            </w:r>
+          </w:p>
+        </w:tc>
+        <w:tc>
+          <w:tcPr>
+            <w:tcW w:type="dxa" w:w="1872"/>
+            <w:shd w:fill="FFFFFF"/>
+            <w:tcMar>
+              <w:top w:w="80" w:type="dxa"/>
+              <w:bottom w:w="80" w:type="dxa"/>
+              <w:left w:w="140" w:type="dxa"/>
+              <w:right w:w="140" w:type="dxa"/>
+            </w:tcMar>
+          </w:tcPr>
+          <w:p>
+            <w:pPr>
+              <w:spacing w:before="40" w:after="40"/>
+            </w:pPr>
+            <w:r>
+              <w:rPr>
+                <w:rFonts w:ascii="Calibri" w:hAnsi="Calibri"/>
+                <w:color w:val="282828"/>
+                <w:sz w:val="18"/>
+              </w:rPr>
+              <w:t>CUSTOMER_ORDER</w:t>
+            </w:r>
+          </w:p>
+        </w:tc>
+        <w:tc>
+          <w:tcPr>
+            <w:tcW w:type="dxa" w:w="1872"/>
+            <w:shd w:fill="FFFFFF"/>
+            <w:tcMar>
+              <w:top w:w="80" w:type="dxa"/>
+              <w:bottom w:w="80" w:type="dxa"/>
+              <w:left w:w="140" w:type="dxa"/>
+              <w:right w:w="140" w:type="dxa"/>
+            </w:tcMar>
+          </w:tcPr>
+          <w:p>
+            <w:pPr>
+              <w:spacing w:before="40" w:after="40"/>
+            </w:pPr>
+            <w:r>
+              <w:rPr>
+                <w:rFonts w:ascii="Calibri" w:hAnsi="Calibri"/>
+                <w:color w:val="282828"/>
+                <w:sz w:val="18"/>
+              </w:rPr>
+              <w:t>1 : N</w:t>
+            </w:r>
+          </w:p>
+        </w:tc>
+        <w:tc>
+          <w:tcPr>
+            <w:tcW w:type="dxa" w:w="1872"/>
+            <w:shd w:fill="FFFFFF"/>
+            <w:tcMar>
+              <w:top w:w="80" w:type="dxa"/>
+              <w:bottom w:w="80" w:type="dxa"/>
+              <w:left w:w="140" w:type="dxa"/>
+              <w:right w:w="140" w:type="dxa"/>
+            </w:tcMar>
+          </w:tcPr>
+          <w:p>
+            <w:pPr>
+              <w:spacing w:before="40" w:after="40"/>
+            </w:pPr>
+            <w:r>
+              <w:rPr>
+                <w:rFonts w:ascii="Calibri" w:hAnsi="Calibri"/>
+                <w:color w:val="282828"/>
+                <w:sz w:val="18"/>
+              </w:rPr>
+              <w:t>ORDER_STATUS_HISTORY</w:t>
+            </w:r>
+          </w:p>
+        </w:tc>
+        <w:tc>
+          <w:tcPr>
+            <w:tcW w:type="dxa" w:w="1872"/>
+            <w:shd w:fill="FFFFFF"/>
+            <w:tcMar>
+              <w:top w:w="80" w:type="dxa"/>
+              <w:bottom w:w="80" w:type="dxa"/>
+              <w:left w:w="140" w:type="dxa"/>
+              <w:right w:w="140" w:type="dxa"/>
+            </w:tcMar>
+          </w:tcPr>
+          <w:p>
+            <w:pPr>
+              <w:spacing w:before="40" w:after="40"/>
+            </w:pPr>
+            <w:r>
+              <w:rPr>
+                <w:rFonts w:ascii="Calibri" w:hAnsi="Calibri"/>
+                <w:color w:val="282828"/>
+                <w:sz w:val="18"/>
+              </w:rPr>
+              <w:t>Order lifecycle progression logs timestamps across statuses.</w:t>
+            </w:r>
+          </w:p>
+        </w:tc>
+      </w:tr>
+      <w:tr>
+        <w:tc>
+          <w:tcPr>
+            <w:tcW w:type="dxa" w:w="1872"/>
+            <w:shd w:fill="F9FAFC"/>
+            <w:tcMar>
+              <w:top w:w="80" w:type="dxa"/>
+              <w:bottom w:w="80" w:type="dxa"/>
+              <w:left w:w="140" w:type="dxa"/>
+              <w:right w:w="140" w:type="dxa"/>
+            </w:tcMar>
+          </w:tcPr>
+          <w:p>
+            <w:pPr>
+              <w:spacing w:before="40" w:after="40"/>
+            </w:pPr>
+            <w:r>
+              <w:rPr>
+                <w:rFonts w:ascii="Calibri" w:hAnsi="Calibri"/>
+                <w:color w:val="282828"/>
+                <w:sz w:val="18"/>
+              </w:rPr>
+              <w:t>R16</w:t>
+            </w:r>
+          </w:p>
+        </w:tc>
+        <w:tc>
+          <w:tcPr>
+            <w:tcW w:type="dxa" w:w="1872"/>
+            <w:shd w:fill="F9FAFC"/>
+            <w:tcMar>
+              <w:top w:w="80" w:type="dxa"/>
+              <w:bottom w:w="80" w:type="dxa"/>
+              <w:left w:w="140" w:type="dxa"/>
+              <w:right w:w="140" w:type="dxa"/>
+            </w:tcMar>
+          </w:tcPr>
+          <w:p>
+            <w:pPr>
+              <w:spacing w:before="40" w:after="40"/>
+            </w:pPr>
+            <w:r>
+              <w:rPr>
+                <w:rFonts w:ascii="Calibri" w:hAnsi="Calibri"/>
+                <w:color w:val="282828"/>
+                <w:sz w:val="18"/>
+              </w:rPr>
+              <w:t>CUSTOMER_ORDER</w:t>
+            </w:r>
+          </w:p>
+        </w:tc>
+        <w:tc>
+          <w:tcPr>
+            <w:tcW w:type="dxa" w:w="1872"/>
+            <w:shd w:fill="F9FAFC"/>
+            <w:tcMar>
+              <w:top w:w="80" w:type="dxa"/>
+              <w:bottom w:w="80" w:type="dxa"/>
+              <w:left w:w="140" w:type="dxa"/>
+              <w:right w:w="140" w:type="dxa"/>
+            </w:tcMar>
+          </w:tcPr>
+          <w:p>
+            <w:pPr>
+              <w:spacing w:before="40" w:after="40"/>
+            </w:pPr>
+            <w:r>
+              <w:rPr>
+                <w:rFonts w:ascii="Calibri" w:hAnsi="Calibri"/>
+                <w:color w:val="282828"/>
+                <w:sz w:val="18"/>
+              </w:rPr>
+              <w:t>1 : 1</w:t>
+            </w:r>
+          </w:p>
+        </w:tc>
+        <w:tc>
+          <w:tcPr>
+            <w:tcW w:type="dxa" w:w="1872"/>
+            <w:shd w:fill="F9FAFC"/>
+            <w:tcMar>
+              <w:top w:w="80" w:type="dxa"/>
+              <w:bottom w:w="80" w:type="dxa"/>
+              <w:left w:w="140" w:type="dxa"/>
+              <w:right w:w="140" w:type="dxa"/>
+            </w:tcMar>
+          </w:tcPr>
+          <w:p>
+            <w:pPr>
+              <w:spacing w:before="40" w:after="40"/>
+            </w:pPr>
+            <w:r>
+              <w:rPr>
+                <w:rFonts w:ascii="Calibri" w:hAnsi="Calibri"/>
+                <w:color w:val="282828"/>
+                <w:sz w:val="18"/>
+              </w:rPr>
+              <w:t>KITCHEN_TICKET</w:t>
+            </w:r>
+          </w:p>
+        </w:tc>
+        <w:tc>
+          <w:tcPr>
+            <w:tcW w:type="dxa" w:w="1872"/>
+            <w:shd w:fill="F9FAFC"/>
+            <w:tcMar>
+              <w:top w:w="80" w:type="dxa"/>
+              <w:bottom w:w="80" w:type="dxa"/>
+              <w:left w:w="140" w:type="dxa"/>
+              <w:right w:w="140" w:type="dxa"/>
+            </w:tcMar>
+          </w:tcPr>
+          <w:p>
+            <w:pPr>
+              <w:spacing w:before="40" w:after="40"/>
+            </w:pPr>
+            <w:r>
+              <w:rPr>
+                <w:rFonts w:ascii="Calibri" w:hAnsi="Calibri"/>
+                <w:color w:val="282828"/>
+                <w:sz w:val="18"/>
+              </w:rPr>
+              <w:t>Order submission automatically generates a corresponding kitchen prep ticket.</w:t>
+            </w:r>
+          </w:p>
+        </w:tc>
+      </w:tr>
+      <w:tr>
+        <w:tc>
+          <w:tcPr>
+            <w:tcW w:type="dxa" w:w="1872"/>
+            <w:shd w:fill="FFFFFF"/>
+            <w:tcMar>
+              <w:top w:w="80" w:type="dxa"/>
+              <w:bottom w:w="80" w:type="dxa"/>
+              <w:left w:w="140" w:type="dxa"/>
+              <w:right w:w="140" w:type="dxa"/>
+            </w:tcMar>
+          </w:tcPr>
+          <w:p>
+            <w:pPr>
+              <w:spacing w:before="40" w:after="40"/>
+            </w:pPr>
+            <w:r>
+              <w:rPr>
+                <w:rFonts w:ascii="Calibri" w:hAnsi="Calibri"/>
+                <w:color w:val="282828"/>
+                <w:sz w:val="18"/>
+              </w:rPr>
+              <w:t>R17</w:t>
+            </w:r>
+          </w:p>
+        </w:tc>
+        <w:tc>
+          <w:tcPr>
+            <w:tcW w:type="dxa" w:w="1872"/>
+            <w:shd w:fill="FFFFFF"/>
+            <w:tcMar>
+              <w:top w:w="80" w:type="dxa"/>
+              <w:bottom w:w="80" w:type="dxa"/>
+              <w:left w:w="140" w:type="dxa"/>
+              <w:right w:w="140" w:type="dxa"/>
+            </w:tcMar>
+          </w:tcPr>
+          <w:p>
+            <w:pPr>
+              <w:spacing w:before="40" w:after="40"/>
+            </w:pPr>
+            <w:r>
+              <w:rPr>
+                <w:rFonts w:ascii="Calibri" w:hAnsi="Calibri"/>
+                <w:color w:val="282828"/>
+                <w:sz w:val="18"/>
+              </w:rPr>
+              <w:t>KITCHEN_TICKET</w:t>
+            </w:r>
+          </w:p>
+        </w:tc>
+        <w:tc>
+          <w:tcPr>
+            <w:tcW w:type="dxa" w:w="1872"/>
+            <w:shd w:fill="FFFFFF"/>
+            <w:tcMar>
+              <w:top w:w="80" w:type="dxa"/>
+              <w:bottom w:w="80" w:type="dxa"/>
+              <w:left w:w="140" w:type="dxa"/>
+              <w:right w:w="140" w:type="dxa"/>
+            </w:tcMar>
+          </w:tcPr>
+          <w:p>
+            <w:pPr>
+              <w:spacing w:before="40" w:after="40"/>
+            </w:pPr>
+            <w:r>
+              <w:rPr>
+                <w:rFonts w:ascii="Calibri" w:hAnsi="Calibri"/>
+                <w:color w:val="282828"/>
+                <w:sz w:val="18"/>
+              </w:rPr>
+              <w:t>1 : N</w:t>
+            </w:r>
+          </w:p>
+        </w:tc>
+        <w:tc>
+          <w:tcPr>
+            <w:tcW w:type="dxa" w:w="1872"/>
+            <w:shd w:fill="FFFFFF"/>
+            <w:tcMar>
+              <w:top w:w="80" w:type="dxa"/>
+              <w:bottom w:w="80" w:type="dxa"/>
+              <w:left w:w="140" w:type="dxa"/>
+              <w:right w:w="140" w:type="dxa"/>
+            </w:tcMar>
+          </w:tcPr>
+          <w:p>
+            <w:pPr>
+              <w:spacing w:before="40" w:after="40"/>
+            </w:pPr>
+            <w:r>
+              <w:rPr>
+                <w:rFonts w:ascii="Calibri" w:hAnsi="Calibri"/>
+                <w:color w:val="282828"/>
+                <w:sz w:val="18"/>
+              </w:rPr>
+              <w:t>KITCHEN_TICKET_ITEM</w:t>
+            </w:r>
+          </w:p>
+        </w:tc>
+        <w:tc>
+          <w:tcPr>
+            <w:tcW w:type="dxa" w:w="1872"/>
+            <w:shd w:fill="FFFFFF"/>
+            <w:tcMar>
+              <w:top w:w="80" w:type="dxa"/>
+              <w:bottom w:w="80" w:type="dxa"/>
+              <w:left w:w="140" w:type="dxa"/>
+              <w:right w:w="140" w:type="dxa"/>
+            </w:tcMar>
+          </w:tcPr>
+          <w:p>
+            <w:pPr>
+              <w:spacing w:before="40" w:after="40"/>
+            </w:pPr>
+            <w:r>
+              <w:rPr>
+                <w:rFonts w:ascii="Calibri" w:hAnsi="Calibri"/>
+                <w:color w:val="282828"/>
+                <w:sz w:val="18"/>
+              </w:rPr>
+              <w:t>Kitchen tickets contain individual item tasks for prep stations.</w:t>
+            </w:r>
+          </w:p>
+        </w:tc>
+      </w:tr>
+      <w:tr>
+        <w:tc>
+          <w:tcPr>
+            <w:tcW w:type="dxa" w:w="1872"/>
+            <w:shd w:fill="F9FAFC"/>
+            <w:tcMar>
+              <w:top w:w="80" w:type="dxa"/>
+              <w:bottom w:w="80" w:type="dxa"/>
+              <w:left w:w="140" w:type="dxa"/>
+              <w:right w:w="140" w:type="dxa"/>
+            </w:tcMar>
+          </w:tcPr>
+          <w:p>
+            <w:pPr>
+              <w:spacing w:before="40" w:after="40"/>
+            </w:pPr>
+            <w:r>
+              <w:rPr>
+                <w:rFonts w:ascii="Calibri" w:hAnsi="Calibri"/>
+                <w:color w:val="282828"/>
+                <w:sz w:val="18"/>
+              </w:rPr>
+              <w:t>R18</w:t>
+            </w:r>
+          </w:p>
+        </w:tc>
+        <w:tc>
+          <w:tcPr>
+            <w:tcW w:type="dxa" w:w="1872"/>
+            <w:shd w:fill="F9FAFC"/>
+            <w:tcMar>
+              <w:top w:w="80" w:type="dxa"/>
+              <w:bottom w:w="80" w:type="dxa"/>
+              <w:left w:w="140" w:type="dxa"/>
+              <w:right w:w="140" w:type="dxa"/>
+            </w:tcMar>
+          </w:tcPr>
+          <w:p>
+            <w:pPr>
+              <w:spacing w:before="40" w:after="40"/>
+            </w:pPr>
+            <w:r>
+              <w:rPr>
+                <w:rFonts w:ascii="Calibri" w:hAnsi="Calibri"/>
+                <w:color w:val="282828"/>
+                <w:sz w:val="18"/>
+              </w:rPr>
+              <w:t>ORDER_ITEM</w:t>
+            </w:r>
+          </w:p>
+        </w:tc>
+        <w:tc>
+          <w:tcPr>
+            <w:tcW w:type="dxa" w:w="1872"/>
+            <w:shd w:fill="F9FAFC"/>
+            <w:tcMar>
+              <w:top w:w="80" w:type="dxa"/>
+              <w:bottom w:w="80" w:type="dxa"/>
+              <w:left w:w="140" w:type="dxa"/>
+              <w:right w:w="140" w:type="dxa"/>
+            </w:tcMar>
+          </w:tcPr>
+          <w:p>
+            <w:pPr>
+              <w:spacing w:before="40" w:after="40"/>
+            </w:pPr>
+            <w:r>
+              <w:rPr>
+                <w:rFonts w:ascii="Calibri" w:hAnsi="Calibri"/>
+                <w:color w:val="282828"/>
+                <w:sz w:val="18"/>
+              </w:rPr>
+              <w:t>1 : N</w:t>
+            </w:r>
+          </w:p>
+        </w:tc>
+        <w:tc>
+          <w:tcPr>
+            <w:tcW w:type="dxa" w:w="1872"/>
+            <w:shd w:fill="F9FAFC"/>
+            <w:tcMar>
+              <w:top w:w="80" w:type="dxa"/>
+              <w:bottom w:w="80" w:type="dxa"/>
+              <w:left w:w="140" w:type="dxa"/>
+              <w:right w:w="140" w:type="dxa"/>
+            </w:tcMar>
+          </w:tcPr>
+          <w:p>
+            <w:pPr>
+              <w:spacing w:before="40" w:after="40"/>
+            </w:pPr>
+            <w:r>
+              <w:rPr>
+                <w:rFonts w:ascii="Calibri" w:hAnsi="Calibri"/>
+                <w:color w:val="282828"/>
+                <w:sz w:val="18"/>
+              </w:rPr>
+              <w:t>KITCHEN_TICKET_ITEM</w:t>
+            </w:r>
+          </w:p>
+        </w:tc>
+        <w:tc>
+          <w:tcPr>
+            <w:tcW w:type="dxa" w:w="1872"/>
+            <w:shd w:fill="F9FAFC"/>
+            <w:tcMar>
+              <w:top w:w="80" w:type="dxa"/>
+              <w:bottom w:w="80" w:type="dxa"/>
+              <w:left w:w="140" w:type="dxa"/>
+              <w:right w:w="140" w:type="dxa"/>
+            </w:tcMar>
+          </w:tcPr>
+          <w:p>
+            <w:pPr>
+              <w:spacing w:before="40" w:after="40"/>
+            </w:pPr>
+            <w:r>
+              <w:rPr>
+                <w:rFonts w:ascii="Calibri" w:hAnsi="Calibri"/>
+                <w:color w:val="282828"/>
+                <w:sz w:val="18"/>
+              </w:rPr>
+              <w:t>Each ordered dish line item routes to its kitchen display tracker.</w:t>
+            </w:r>
+          </w:p>
+        </w:tc>
+      </w:tr>
+      <w:tr>
+        <w:tc>
+          <w:tcPr>
+            <w:tcW w:type="dxa" w:w="1872"/>
+            <w:shd w:fill="FFFFFF"/>
+            <w:tcMar>
+              <w:top w:w="80" w:type="dxa"/>
+              <w:bottom w:w="80" w:type="dxa"/>
+              <w:left w:w="140" w:type="dxa"/>
+              <w:right w:w="140" w:type="dxa"/>
+            </w:tcMar>
+          </w:tcPr>
+          <w:p>
+            <w:pPr>
+              <w:spacing w:before="40" w:after="40"/>
+            </w:pPr>
+            <w:r>
+              <w:rPr>
+                <w:rFonts w:ascii="Calibri" w:hAnsi="Calibri"/>
+                <w:color w:val="282828"/>
+                <w:sz w:val="18"/>
+              </w:rPr>
+              <w:t>R19</w:t>
+            </w:r>
+          </w:p>
+        </w:tc>
+        <w:tc>
+          <w:tcPr>
+            <w:tcW w:type="dxa" w:w="1872"/>
+            <w:shd w:fill="FFFFFF"/>
+            <w:tcMar>
+              <w:top w:w="80" w:type="dxa"/>
+              <w:bottom w:w="80" w:type="dxa"/>
+              <w:left w:w="140" w:type="dxa"/>
+              <w:right w:w="140" w:type="dxa"/>
+            </w:tcMar>
+          </w:tcPr>
+          <w:p>
+            <w:pPr>
+              <w:spacing w:before="40" w:after="40"/>
+            </w:pPr>
+            <w:r>
+              <w:rPr>
+                <w:rFonts w:ascii="Calibri" w:hAnsi="Calibri"/>
+                <w:color w:val="282828"/>
+                <w:sz w:val="18"/>
+              </w:rPr>
+              <w:t>DINING_SESSION</w:t>
+            </w:r>
+          </w:p>
+        </w:tc>
+        <w:tc>
+          <w:tcPr>
+            <w:tcW w:type="dxa" w:w="1872"/>
+            <w:shd w:fill="FFFFFF"/>
+            <w:tcMar>
+              <w:top w:w="80" w:type="dxa"/>
+              <w:bottom w:w="80" w:type="dxa"/>
+              <w:left w:w="140" w:type="dxa"/>
+              <w:right w:w="140" w:type="dxa"/>
+            </w:tcMar>
+          </w:tcPr>
+          <w:p>
+            <w:pPr>
+              <w:spacing w:before="40" w:after="40"/>
+            </w:pPr>
+            <w:r>
+              <w:rPr>
+                <w:rFonts w:ascii="Calibri" w:hAnsi="Calibri"/>
+                <w:color w:val="282828"/>
+                <w:sz w:val="18"/>
+              </w:rPr>
+              <w:t>1 : 1</w:t>
+            </w:r>
+          </w:p>
+        </w:tc>
+        <w:tc>
+          <w:tcPr>
+            <w:tcW w:type="dxa" w:w="1872"/>
+            <w:shd w:fill="FFFFFF"/>
+            <w:tcMar>
+              <w:top w:w="80" w:type="dxa"/>
+              <w:bottom w:w="80" w:type="dxa"/>
+              <w:left w:w="140" w:type="dxa"/>
+              <w:right w:w="140" w:type="dxa"/>
+            </w:tcMar>
+          </w:tcPr>
+          <w:p>
+            <w:pPr>
+              <w:spacing w:before="40" w:after="40"/>
+            </w:pPr>
+            <w:r>
+              <w:rPr>
+                <w:rFonts w:ascii="Calibri" w:hAnsi="Calibri"/>
+                <w:color w:val="282828"/>
+                <w:sz w:val="18"/>
+              </w:rPr>
+              <w:t>BILL</w:t>
+            </w:r>
+          </w:p>
+        </w:tc>
+        <w:tc>
+          <w:tcPr>
+            <w:tcW w:type="dxa" w:w="1872"/>
+            <w:shd w:fill="FFFFFF"/>
+            <w:tcMar>
+              <w:top w:w="80" w:type="dxa"/>
+              <w:bottom w:w="80" w:type="dxa"/>
+              <w:left w:w="140" w:type="dxa"/>
+              <w:right w:w="140" w:type="dxa"/>
+            </w:tcMar>
+          </w:tcPr>
+          <w:p>
+            <w:pPr>
+              <w:spacing w:before="40" w:after="40"/>
+            </w:pPr>
+            <w:r>
+              <w:rPr>
+                <w:rFonts w:ascii="Calibri" w:hAnsi="Calibri"/>
+                <w:color w:val="282828"/>
+                <w:sz w:val="18"/>
+              </w:rPr>
+              <w:t>A concluded dining session generates a unified financial invoice bill.</w:t>
+            </w:r>
+          </w:p>
+        </w:tc>
+      </w:tr>
+      <w:tr>
+        <w:tc>
+          <w:tcPr>
+            <w:tcW w:type="dxa" w:w="1872"/>
+            <w:shd w:fill="F9FAFC"/>
+            <w:tcMar>
+              <w:top w:w="80" w:type="dxa"/>
+              <w:bottom w:w="80" w:type="dxa"/>
+              <w:left w:w="140" w:type="dxa"/>
+              <w:right w:w="140" w:type="dxa"/>
+            </w:tcMar>
+          </w:tcPr>
+          <w:p>
+            <w:pPr>
+              <w:spacing w:before="40" w:after="40"/>
+            </w:pPr>
+            <w:r>
+              <w:rPr>
+                <w:rFonts w:ascii="Calibri" w:hAnsi="Calibri"/>
+                <w:color w:val="282828"/>
+                <w:sz w:val="18"/>
+              </w:rPr>
+              <w:t>R20</w:t>
+            </w:r>
+          </w:p>
+        </w:tc>
+        <w:tc>
+          <w:tcPr>
+            <w:tcW w:type="dxa" w:w="1872"/>
+            <w:shd w:fill="F9FAFC"/>
+            <w:tcMar>
+              <w:top w:w="80" w:type="dxa"/>
+              <w:bottom w:w="80" w:type="dxa"/>
+              <w:left w:w="140" w:type="dxa"/>
+              <w:right w:w="140" w:type="dxa"/>
+            </w:tcMar>
+          </w:tcPr>
+          <w:p>
+            <w:pPr>
+              <w:spacing w:before="40" w:after="40"/>
+            </w:pPr>
+            <w:r>
+              <w:rPr>
+                <w:rFonts w:ascii="Calibri" w:hAnsi="Calibri"/>
+                <w:color w:val="282828"/>
+                <w:sz w:val="18"/>
+              </w:rPr>
+              <w:t>BILL</w:t>
+            </w:r>
+          </w:p>
+        </w:tc>
+        <w:tc>
+          <w:tcPr>
+            <w:tcW w:type="dxa" w:w="1872"/>
+            <w:shd w:fill="F9FAFC"/>
+            <w:tcMar>
+              <w:top w:w="80" w:type="dxa"/>
+              <w:bottom w:w="80" w:type="dxa"/>
+              <w:left w:w="140" w:type="dxa"/>
+              <w:right w:w="140" w:type="dxa"/>
+            </w:tcMar>
+          </w:tcPr>
+          <w:p>
+            <w:pPr>
+              <w:spacing w:before="40" w:after="40"/>
+            </w:pPr>
+            <w:r>
+              <w:rPr>
+                <w:rFonts w:ascii="Calibri" w:hAnsi="Calibri"/>
+                <w:color w:val="282828"/>
+                <w:sz w:val="18"/>
+              </w:rPr>
+              <w:t>1 : N</w:t>
+            </w:r>
+          </w:p>
+        </w:tc>
+        <w:tc>
+          <w:tcPr>
+            <w:tcW w:type="dxa" w:w="1872"/>
+            <w:shd w:fill="F9FAFC"/>
+            <w:tcMar>
+              <w:top w:w="80" w:type="dxa"/>
+              <w:bottom w:w="80" w:type="dxa"/>
+              <w:left w:w="140" w:type="dxa"/>
+              <w:right w:w="140" w:type="dxa"/>
+            </w:tcMar>
+          </w:tcPr>
+          <w:p>
+            <w:pPr>
+              <w:spacing w:before="40" w:after="40"/>
+            </w:pPr>
+            <w:r>
+              <w:rPr>
+                <w:rFonts w:ascii="Calibri" w:hAnsi="Calibri"/>
+                <w:color w:val="282828"/>
+                <w:sz w:val="18"/>
+              </w:rPr>
+              <w:t>BILL_ITEM</w:t>
+            </w:r>
+          </w:p>
+        </w:tc>
+        <w:tc>
+          <w:tcPr>
+            <w:tcW w:type="dxa" w:w="1872"/>
+            <w:shd w:fill="F9FAFC"/>
+            <w:tcMar>
+              <w:top w:w="80" w:type="dxa"/>
+              <w:bottom w:w="80" w:type="dxa"/>
+              <w:left w:w="140" w:type="dxa"/>
+              <w:right w:w="140" w:type="dxa"/>
+            </w:tcMar>
+          </w:tcPr>
+          <w:p>
+            <w:pPr>
+              <w:spacing w:before="40" w:after="40"/>
+            </w:pPr>
+            <w:r>
+              <w:rPr>
+                <w:rFonts w:ascii="Calibri" w:hAnsi="Calibri"/>
+                <w:color w:val="282828"/>
+                <w:sz w:val="18"/>
+              </w:rPr>
+              <w:t>Bills itemize ordered items with price snapshots and subtotal lines.</w:t>
+            </w:r>
+          </w:p>
+        </w:tc>
+      </w:tr>
+      <w:tr>
+        <w:tc>
+          <w:tcPr>
+            <w:tcW w:type="dxa" w:w="1872"/>
+            <w:shd w:fill="FFFFFF"/>
+            <w:tcMar>
+              <w:top w:w="80" w:type="dxa"/>
+              <w:bottom w:w="80" w:type="dxa"/>
+              <w:left w:w="140" w:type="dxa"/>
+              <w:right w:w="140" w:type="dxa"/>
+            </w:tcMar>
+          </w:tcPr>
+          <w:p>
+            <w:pPr>
+              <w:spacing w:before="40" w:after="40"/>
+            </w:pPr>
+            <w:r>
+              <w:rPr>
+                <w:rFonts w:ascii="Calibri" w:hAnsi="Calibri"/>
+                <w:color w:val="282828"/>
+                <w:sz w:val="18"/>
+              </w:rPr>
+              <w:t>R21</w:t>
+            </w:r>
+          </w:p>
+        </w:tc>
+        <w:tc>
+          <w:tcPr>
+            <w:tcW w:type="dxa" w:w="1872"/>
+            <w:shd w:fill="FFFFFF"/>
+            <w:tcMar>
+              <w:top w:w="80" w:type="dxa"/>
+              <w:bottom w:w="80" w:type="dxa"/>
+              <w:left w:w="140" w:type="dxa"/>
+              <w:right w:w="140" w:type="dxa"/>
+            </w:tcMar>
+          </w:tcPr>
+          <w:p>
+            <w:pPr>
+              <w:spacing w:before="40" w:after="40"/>
+            </w:pPr>
+            <w:r>
+              <w:rPr>
+                <w:rFonts w:ascii="Calibri" w:hAnsi="Calibri"/>
+                <w:color w:val="282828"/>
+                <w:sz w:val="18"/>
+              </w:rPr>
+              <w:t>ORDER_ITEM</w:t>
+            </w:r>
+          </w:p>
+        </w:tc>
+        <w:tc>
+          <w:tcPr>
+            <w:tcW w:type="dxa" w:w="1872"/>
+            <w:shd w:fill="FFFFFF"/>
+            <w:tcMar>
+              <w:top w:w="80" w:type="dxa"/>
+              <w:bottom w:w="80" w:type="dxa"/>
+              <w:left w:w="140" w:type="dxa"/>
+              <w:right w:w="140" w:type="dxa"/>
+            </w:tcMar>
+          </w:tcPr>
+          <w:p>
+            <w:pPr>
+              <w:spacing w:before="40" w:after="40"/>
+            </w:pPr>
+            <w:r>
+              <w:rPr>
+                <w:rFonts w:ascii="Calibri" w:hAnsi="Calibri"/>
+                <w:color w:val="282828"/>
+                <w:sz w:val="18"/>
+              </w:rPr>
+              <w:t>1 : N</w:t>
+            </w:r>
+          </w:p>
+        </w:tc>
+        <w:tc>
+          <w:tcPr>
+            <w:tcW w:type="dxa" w:w="1872"/>
+            <w:shd w:fill="FFFFFF"/>
+            <w:tcMar>
+              <w:top w:w="80" w:type="dxa"/>
+              <w:bottom w:w="80" w:type="dxa"/>
+              <w:left w:w="140" w:type="dxa"/>
+              <w:right w:w="140" w:type="dxa"/>
+            </w:tcMar>
+          </w:tcPr>
+          <w:p>
+            <w:pPr>
+              <w:spacing w:before="40" w:after="40"/>
+            </w:pPr>
+            <w:r>
+              <w:rPr>
+                <w:rFonts w:ascii="Calibri" w:hAnsi="Calibri"/>
+                <w:color w:val="282828"/>
+                <w:sz w:val="18"/>
+              </w:rPr>
+              <w:t>BILL_ITEM</w:t>
+            </w:r>
+          </w:p>
+        </w:tc>
+        <w:tc>
+          <w:tcPr>
+            <w:tcW w:type="dxa" w:w="1872"/>
+            <w:shd w:fill="FFFFFF"/>
+            <w:tcMar>
+              <w:top w:w="80" w:type="dxa"/>
+              <w:bottom w:w="80" w:type="dxa"/>
+              <w:left w:w="140" w:type="dxa"/>
+              <w:right w:w="140" w:type="dxa"/>
+            </w:tcMar>
+          </w:tcPr>
+          <w:p>
+            <w:pPr>
+              <w:spacing w:before="40" w:after="40"/>
+            </w:pPr>
+            <w:r>
+              <w:rPr>
+                <w:rFonts w:ascii="Calibri" w:hAnsi="Calibri"/>
+                <w:color w:val="282828"/>
+                <w:sz w:val="18"/>
+              </w:rPr>
+              <w:t>Order line items are snapshotted into immutable bill lines.</w:t>
+            </w:r>
+          </w:p>
+        </w:tc>
+      </w:tr>
+      <w:tr>
+        <w:tc>
+          <w:tcPr>
+            <w:tcW w:type="dxa" w:w="1872"/>
+            <w:shd w:fill="F9FAFC"/>
+            <w:tcMar>
+              <w:top w:w="80" w:type="dxa"/>
+              <w:bottom w:w="80" w:type="dxa"/>
+              <w:left w:w="140" w:type="dxa"/>
+              <w:right w:w="140" w:type="dxa"/>
+            </w:tcMar>
+          </w:tcPr>
+          <w:p>
+            <w:pPr>
+              <w:spacing w:before="40" w:after="40"/>
+            </w:pPr>
+            <w:r>
+              <w:rPr>
+                <w:rFonts w:ascii="Calibri" w:hAnsi="Calibri"/>
+                <w:color w:val="282828"/>
+                <w:sz w:val="18"/>
+              </w:rPr>
+              <w:t>R22</w:t>
+            </w:r>
+          </w:p>
+        </w:tc>
+        <w:tc>
+          <w:tcPr>
+            <w:tcW w:type="dxa" w:w="1872"/>
+            <w:shd w:fill="F9FAFC"/>
+            <w:tcMar>
+              <w:top w:w="80" w:type="dxa"/>
+              <w:bottom w:w="80" w:type="dxa"/>
+              <w:left w:w="140" w:type="dxa"/>
+              <w:right w:w="140" w:type="dxa"/>
+            </w:tcMar>
+          </w:tcPr>
+          <w:p>
+            <w:pPr>
+              <w:spacing w:before="40" w:after="40"/>
+            </w:pPr>
+            <w:r>
+              <w:rPr>
+                <w:rFonts w:ascii="Calibri" w:hAnsi="Calibri"/>
+                <w:color w:val="282828"/>
+                <w:sz w:val="18"/>
+              </w:rPr>
+              <w:t>DISCOUNT</w:t>
+            </w:r>
+          </w:p>
+        </w:tc>
+        <w:tc>
+          <w:tcPr>
+            <w:tcW w:type="dxa" w:w="1872"/>
+            <w:shd w:fill="F9FAFC"/>
+            <w:tcMar>
+              <w:top w:w="80" w:type="dxa"/>
+              <w:bottom w:w="80" w:type="dxa"/>
+              <w:left w:w="140" w:type="dxa"/>
+              <w:right w:w="140" w:type="dxa"/>
+            </w:tcMar>
+          </w:tcPr>
+          <w:p>
+            <w:pPr>
+              <w:spacing w:before="40" w:after="40"/>
+            </w:pPr>
+            <w:r>
+              <w:rPr>
+                <w:rFonts w:ascii="Calibri" w:hAnsi="Calibri"/>
+                <w:color w:val="282828"/>
+                <w:sz w:val="18"/>
+              </w:rPr>
+              <w:t>1 : N</w:t>
+            </w:r>
+          </w:p>
+        </w:tc>
+        <w:tc>
+          <w:tcPr>
+            <w:tcW w:type="dxa" w:w="1872"/>
+            <w:shd w:fill="F9FAFC"/>
+            <w:tcMar>
+              <w:top w:w="80" w:type="dxa"/>
+              <w:bottom w:w="80" w:type="dxa"/>
+              <w:left w:w="140" w:type="dxa"/>
+              <w:right w:w="140" w:type="dxa"/>
+            </w:tcMar>
+          </w:tcPr>
+          <w:p>
+            <w:pPr>
+              <w:spacing w:before="40" w:after="40"/>
+            </w:pPr>
+            <w:r>
+              <w:rPr>
+                <w:rFonts w:ascii="Calibri" w:hAnsi="Calibri"/>
+                <w:color w:val="282828"/>
+                <w:sz w:val="18"/>
+              </w:rPr>
+              <w:t>DISCOUNT_APPLICATION</w:t>
+            </w:r>
+          </w:p>
+        </w:tc>
+        <w:tc>
+          <w:tcPr>
+            <w:tcW w:type="dxa" w:w="1872"/>
+            <w:shd w:fill="F9FAFC"/>
+            <w:tcMar>
+              <w:top w:w="80" w:type="dxa"/>
+              <w:bottom w:w="80" w:type="dxa"/>
+              <w:left w:w="140" w:type="dxa"/>
+              <w:right w:w="140" w:type="dxa"/>
+            </w:tcMar>
+          </w:tcPr>
+          <w:p>
+            <w:pPr>
+              <w:spacing w:before="40" w:after="40"/>
+            </w:pPr>
+            <w:r>
+              <w:rPr>
+                <w:rFonts w:ascii="Calibri" w:hAnsi="Calibri"/>
+                <w:color w:val="282828"/>
+                <w:sz w:val="18"/>
+              </w:rPr>
+              <w:t>Promotional discount codes are applied via application ledgers.</w:t>
+            </w:r>
+          </w:p>
+        </w:tc>
+      </w:tr>
+      <w:tr>
+        <w:tc>
+          <w:tcPr>
+            <w:tcW w:type="dxa" w:w="1872"/>
+            <w:shd w:fill="FFFFFF"/>
+            <w:tcMar>
+              <w:top w:w="80" w:type="dxa"/>
+              <w:bottom w:w="80" w:type="dxa"/>
+              <w:left w:w="140" w:type="dxa"/>
+              <w:right w:w="140" w:type="dxa"/>
+            </w:tcMar>
+          </w:tcPr>
+          <w:p>
+            <w:pPr>
+              <w:spacing w:before="40" w:after="40"/>
+            </w:pPr>
+            <w:r>
+              <w:rPr>
+                <w:rFonts w:ascii="Calibri" w:hAnsi="Calibri"/>
+                <w:color w:val="282828"/>
+                <w:sz w:val="18"/>
+              </w:rPr>
+              <w:t>R23</w:t>
+            </w:r>
+          </w:p>
+        </w:tc>
+        <w:tc>
+          <w:tcPr>
+            <w:tcW w:type="dxa" w:w="1872"/>
+            <w:shd w:fill="FFFFFF"/>
+            <w:tcMar>
+              <w:top w:w="80" w:type="dxa"/>
+              <w:bottom w:w="80" w:type="dxa"/>
+              <w:left w:w="140" w:type="dxa"/>
+              <w:right w:w="140" w:type="dxa"/>
+            </w:tcMar>
+          </w:tcPr>
+          <w:p>
+            <w:pPr>
+              <w:spacing w:before="40" w:after="40"/>
+            </w:pPr>
+            <w:r>
+              <w:rPr>
+                <w:rFonts w:ascii="Calibri" w:hAnsi="Calibri"/>
+                <w:color w:val="282828"/>
+                <w:sz w:val="18"/>
+              </w:rPr>
+              <w:t>BILL</w:t>
+            </w:r>
+          </w:p>
+        </w:tc>
+        <w:tc>
+          <w:tcPr>
+            <w:tcW w:type="dxa" w:w="1872"/>
+            <w:shd w:fill="FFFFFF"/>
+            <w:tcMar>
+              <w:top w:w="80" w:type="dxa"/>
+              <w:bottom w:w="80" w:type="dxa"/>
+              <w:left w:w="140" w:type="dxa"/>
+              <w:right w:w="140" w:type="dxa"/>
+            </w:tcMar>
+          </w:tcPr>
+          <w:p>
+            <w:pPr>
+              <w:spacing w:before="40" w:after="40"/>
+            </w:pPr>
+            <w:r>
+              <w:rPr>
+                <w:rFonts w:ascii="Calibri" w:hAnsi="Calibri"/>
+                <w:color w:val="282828"/>
+                <w:sz w:val="18"/>
+              </w:rPr>
+              <w:t>1 : N</w:t>
+            </w:r>
+          </w:p>
+        </w:tc>
+        <w:tc>
+          <w:tcPr>
+            <w:tcW w:type="dxa" w:w="1872"/>
+            <w:shd w:fill="FFFFFF"/>
+            <w:tcMar>
+              <w:top w:w="80" w:type="dxa"/>
+              <w:bottom w:w="80" w:type="dxa"/>
+              <w:left w:w="140" w:type="dxa"/>
+              <w:right w:w="140" w:type="dxa"/>
+            </w:tcMar>
+          </w:tcPr>
+          <w:p>
+            <w:pPr>
+              <w:spacing w:before="40" w:after="40"/>
+            </w:pPr>
+            <w:r>
+              <w:rPr>
+                <w:rFonts w:ascii="Calibri" w:hAnsi="Calibri"/>
+                <w:color w:val="282828"/>
+                <w:sz w:val="18"/>
+              </w:rPr>
+              <w:t>DISCOUNT_APPLICATION</w:t>
+            </w:r>
+          </w:p>
+        </w:tc>
+        <w:tc>
+          <w:tcPr>
+            <w:tcW w:type="dxa" w:w="1872"/>
+            <w:shd w:fill="FFFFFF"/>
+            <w:tcMar>
+              <w:top w:w="80" w:type="dxa"/>
+              <w:bottom w:w="80" w:type="dxa"/>
+              <w:left w:w="140" w:type="dxa"/>
+              <w:right w:w="140" w:type="dxa"/>
+            </w:tcMar>
+          </w:tcPr>
+          <w:p>
+            <w:pPr>
+              <w:spacing w:before="40" w:after="40"/>
+            </w:pPr>
+            <w:r>
+              <w:rPr>
+                <w:rFonts w:ascii="Calibri" w:hAnsi="Calibri"/>
+                <w:color w:val="282828"/>
+                <w:sz w:val="18"/>
+              </w:rPr>
+              <w:t>Bills receive authorized coupon and promotional reductions.</w:t>
+            </w:r>
+          </w:p>
+        </w:tc>
+      </w:tr>
+      <w:tr>
+        <w:tc>
+          <w:tcPr>
+            <w:tcW w:type="dxa" w:w="1872"/>
+            <w:shd w:fill="F9FAFC"/>
+            <w:tcMar>
+              <w:top w:w="80" w:type="dxa"/>
+              <w:bottom w:w="80" w:type="dxa"/>
+              <w:left w:w="140" w:type="dxa"/>
+              <w:right w:w="140" w:type="dxa"/>
+            </w:tcMar>
+          </w:tcPr>
+          <w:p>
+            <w:pPr>
+              <w:spacing w:before="40" w:after="40"/>
+            </w:pPr>
+            <w:r>
+              <w:rPr>
+                <w:rFonts w:ascii="Calibri" w:hAnsi="Calibri"/>
+                <w:color w:val="282828"/>
+                <w:sz w:val="18"/>
+              </w:rPr>
+              <w:t>R24</w:t>
+            </w:r>
+          </w:p>
+        </w:tc>
+        <w:tc>
+          <w:tcPr>
+            <w:tcW w:type="dxa" w:w="1872"/>
+            <w:shd w:fill="F9FAFC"/>
+            <w:tcMar>
+              <w:top w:w="80" w:type="dxa"/>
+              <w:bottom w:w="80" w:type="dxa"/>
+              <w:left w:w="140" w:type="dxa"/>
+              <w:right w:w="140" w:type="dxa"/>
+            </w:tcMar>
+          </w:tcPr>
+          <w:p>
+            <w:pPr>
+              <w:spacing w:before="40" w:after="40"/>
+            </w:pPr>
+            <w:r>
+              <w:rPr>
+                <w:rFonts w:ascii="Calibri" w:hAnsi="Calibri"/>
+                <w:color w:val="282828"/>
+                <w:sz w:val="18"/>
+              </w:rPr>
+              <w:t>USER_ACCOUNT</w:t>
+            </w:r>
+          </w:p>
+        </w:tc>
+        <w:tc>
+          <w:tcPr>
+            <w:tcW w:type="dxa" w:w="1872"/>
+            <w:shd w:fill="F9FAFC"/>
+            <w:tcMar>
+              <w:top w:w="80" w:type="dxa"/>
+              <w:bottom w:w="80" w:type="dxa"/>
+              <w:left w:w="140" w:type="dxa"/>
+              <w:right w:w="140" w:type="dxa"/>
+            </w:tcMar>
+          </w:tcPr>
+          <w:p>
+            <w:pPr>
+              <w:spacing w:before="40" w:after="40"/>
+            </w:pPr>
+            <w:r>
+              <w:rPr>
+                <w:rFonts w:ascii="Calibri" w:hAnsi="Calibri"/>
+                <w:color w:val="282828"/>
+                <w:sz w:val="18"/>
+              </w:rPr>
+              <w:t>1 : N</w:t>
+            </w:r>
+          </w:p>
+        </w:tc>
+        <w:tc>
+          <w:tcPr>
+            <w:tcW w:type="dxa" w:w="1872"/>
+            <w:shd w:fill="F9FAFC"/>
+            <w:tcMar>
+              <w:top w:w="80" w:type="dxa"/>
+              <w:bottom w:w="80" w:type="dxa"/>
+              <w:left w:w="140" w:type="dxa"/>
+              <w:right w:w="140" w:type="dxa"/>
+            </w:tcMar>
+          </w:tcPr>
+          <w:p>
+            <w:pPr>
+              <w:spacing w:before="40" w:after="40"/>
+            </w:pPr>
+            <w:r>
+              <w:rPr>
+                <w:rFonts w:ascii="Calibri" w:hAnsi="Calibri"/>
+                <w:color w:val="282828"/>
+                <w:sz w:val="18"/>
+              </w:rPr>
+              <w:t>DISCOUNT_APPLICATION</w:t>
+            </w:r>
+          </w:p>
+        </w:tc>
+        <w:tc>
+          <w:tcPr>
+            <w:tcW w:type="dxa" w:w="1872"/>
+            <w:shd w:fill="F9FAFC"/>
+            <w:tcMar>
+              <w:top w:w="80" w:type="dxa"/>
+              <w:bottom w:w="80" w:type="dxa"/>
+              <w:left w:w="140" w:type="dxa"/>
+              <w:right w:w="140" w:type="dxa"/>
+            </w:tcMar>
+          </w:tcPr>
+          <w:p>
+            <w:pPr>
+              <w:spacing w:before="40" w:after="40"/>
+            </w:pPr>
+            <w:r>
+              <w:rPr>
+                <w:rFonts w:ascii="Calibri" w:hAnsi="Calibri"/>
+                <w:color w:val="282828"/>
+                <w:sz w:val="18"/>
+              </w:rPr>
+              <w:t>Staff managers authorize applied discounts on customer bills.</w:t>
+            </w:r>
+          </w:p>
+        </w:tc>
+      </w:tr>
+      <w:tr>
+        <w:tc>
+          <w:tcPr>
+            <w:tcW w:type="dxa" w:w="1872"/>
+            <w:shd w:fill="FFFFFF"/>
+            <w:tcMar>
+              <w:top w:w="80" w:type="dxa"/>
+              <w:bottom w:w="80" w:type="dxa"/>
+              <w:left w:w="140" w:type="dxa"/>
+              <w:right w:w="140" w:type="dxa"/>
+            </w:tcMar>
+          </w:tcPr>
+          <w:p>
+            <w:pPr>
+              <w:spacing w:before="40" w:after="40"/>
+            </w:pPr>
+            <w:r>
+              <w:rPr>
+                <w:rFonts w:ascii="Calibri" w:hAnsi="Calibri"/>
+                <w:color w:val="282828"/>
+                <w:sz w:val="18"/>
+              </w:rPr>
+              <w:t>R25</w:t>
+            </w:r>
+          </w:p>
+        </w:tc>
+        <w:tc>
+          <w:tcPr>
+            <w:tcW w:type="dxa" w:w="1872"/>
+            <w:shd w:fill="FFFFFF"/>
+            <w:tcMar>
+              <w:top w:w="80" w:type="dxa"/>
+              <w:bottom w:w="80" w:type="dxa"/>
+              <w:left w:w="140" w:type="dxa"/>
+              <w:right w:w="140" w:type="dxa"/>
+            </w:tcMar>
+          </w:tcPr>
+          <w:p>
+            <w:pPr>
+              <w:spacing w:before="40" w:after="40"/>
+            </w:pPr>
+            <w:r>
+              <w:rPr>
+                <w:rFonts w:ascii="Calibri" w:hAnsi="Calibri"/>
+                <w:color w:val="282828"/>
+                <w:sz w:val="18"/>
+              </w:rPr>
+              <w:t>BILL</w:t>
+            </w:r>
+          </w:p>
+        </w:tc>
+        <w:tc>
+          <w:tcPr>
+            <w:tcW w:type="dxa" w:w="1872"/>
+            <w:shd w:fill="FFFFFF"/>
+            <w:tcMar>
+              <w:top w:w="80" w:type="dxa"/>
+              <w:bottom w:w="80" w:type="dxa"/>
+              <w:left w:w="140" w:type="dxa"/>
+              <w:right w:w="140" w:type="dxa"/>
+            </w:tcMar>
+          </w:tcPr>
+          <w:p>
+            <w:pPr>
+              <w:spacing w:before="40" w:after="40"/>
+            </w:pPr>
+            <w:r>
+              <w:rPr>
+                <w:rFonts w:ascii="Calibri" w:hAnsi="Calibri"/>
+                <w:color w:val="282828"/>
+                <w:sz w:val="18"/>
+              </w:rPr>
+              <w:t>1 : N</w:t>
+            </w:r>
+          </w:p>
+        </w:tc>
+        <w:tc>
+          <w:tcPr>
+            <w:tcW w:type="dxa" w:w="1872"/>
+            <w:shd w:fill="FFFFFF"/>
+            <w:tcMar>
+              <w:top w:w="80" w:type="dxa"/>
+              <w:bottom w:w="80" w:type="dxa"/>
+              <w:left w:w="140" w:type="dxa"/>
+              <w:right w:w="140" w:type="dxa"/>
+            </w:tcMar>
+          </w:tcPr>
+          <w:p>
+            <w:pPr>
+              <w:spacing w:before="40" w:after="40"/>
+            </w:pPr>
+            <w:r>
+              <w:rPr>
+                <w:rFonts w:ascii="Calibri" w:hAnsi="Calibri"/>
+                <w:color w:val="282828"/>
+                <w:sz w:val="18"/>
+              </w:rPr>
+              <w:t>PAYMENT</w:t>
+            </w:r>
+          </w:p>
+        </w:tc>
+        <w:tc>
+          <w:tcPr>
+            <w:tcW w:type="dxa" w:w="1872"/>
+            <w:shd w:fill="FFFFFF"/>
+            <w:tcMar>
+              <w:top w:w="80" w:type="dxa"/>
+              <w:bottom w:w="80" w:type="dxa"/>
+              <w:left w:w="140" w:type="dxa"/>
+              <w:right w:w="140" w:type="dxa"/>
+            </w:tcMar>
+          </w:tcPr>
+          <w:p>
+            <w:pPr>
+              <w:spacing w:before="40" w:after="40"/>
+            </w:pPr>
+            <w:r>
+              <w:rPr>
+                <w:rFonts w:ascii="Calibri" w:hAnsi="Calibri"/>
+                <w:color w:val="282828"/>
+                <w:sz w:val="18"/>
+              </w:rPr>
+              <w:t>Finalized bills are settled across payment receipts (Cash, Card, UPI).</w:t>
             </w:r>
           </w:p>
         </w:tc>
@@ -2747,25 +4680,45 @@
                 <w:color w:val="1E1E1E"/>
                 <w:sz w:val="18"/>
               </w:rPr>
-              <w:t>1. DINING_AREA(area_id [PK], name, description, atmosphere_type, is_active)</w:t>
+              <w:t>1. BRANCH (branch_id [PK], name, phone, address, created_at, updated_at)</w:t>
               <w:br/>
-              <w:t xml:space="preserve">    2. TABLE_ENTITY(table_id [PK], area_id [FK-&gt;DINING_AREA.area_id], table_number, capacity, is_active)</w:t>
+              <w:t xml:space="preserve">    2. DINING_AREA (area_id [PK], branch_id [FK-&gt;BRANCH.branch_id], name, created_at, updated_at)</w:t>
               <w:br/>
-              <w:t xml:space="preserve">    3. CUSTOMER(customer_id [PK], first_name, last_name, phone [UQ], email, created_at)</w:t>
+              <w:t xml:space="preserve">    3. TABLE_ENTITY (table_id [PK], area_id [FK-&gt;DINING_AREA.area_id], table_number [UQ], capacity, is_active, created_at, updated_at)</w:t>
               <w:br/>
-              <w:t xml:space="preserve">    4. RESERVATION(reservation_id [PK], table_id [FK], customer_id [FK], start_time, end_time, guest_count, status, notes)</w:t>
+              <w:t xml:space="preserve">    4. ROLE (role_id [PK], name [UQ], description)</w:t>
               <w:br/>
-              <w:t xml:space="preserve">    5. MENU_ITEM(item_id [PK], name [UQ], category, price, description, is_available, dietary_flags)</w:t>
+              <w:t xml:space="preserve">    5. USER_ACCOUNT (user_id [PK], role_id [FK-&gt;ROLE.role_id], branch_id [FK-&gt;BRANCH.branch_id], email [UQ], first_name, last_name, password_hash, created_at)</w:t>
               <w:br/>
-              <w:t xml:space="preserve">    6. DINING_SESSION(session_id [PK], table_id [FK], customer_id [FK], opened_at, closed_at, status, guest_count)</w:t>
+              <w:t xml:space="preserve">    6. CUSTOMER (customer_id [PK], first_name, last_name, phone [UQ], email [UQ], created_at, updated_at)</w:t>
               <w:br/>
-              <w:t xml:space="preserve">    7. ORDER_ENTITY(order_id [PK], session_id [FK], status, created_at, kitchen_note, total_amount)</w:t>
+              <w:t xml:space="preserve">    7. RESERVATION (reservation_id [PK], table_id [FK-&gt;TABLE_ENTITY.table_id], customer_id [FK-&gt;CUSTOMER.customer_id], start_time, end_time, guest_count, status, special_requests, created_at, updated_at)</w:t>
               <w:br/>
-              <w:t xml:space="preserve">    8. ORDER_ITEM(order_item_id [PK], order_id [FK], item_id [FK], quantity, unit_price, line_total, special_request)</w:t>
+              <w:t xml:space="preserve">    8. DINING_SESSION (session_id [PK], table_id [FK-&gt;TABLE_ENTITY.table_id], customer_id [FK-&gt;CUSTOMER.customer_id], reservation_id [FK-&gt;RESERVATION.reservation_id], guest_count, status, start_time, end_time, created_at, updated_at)</w:t>
               <w:br/>
-              <w:t xml:space="preserve">    9. BILL_ENTITY(bill_id [PK], session_id [FK], subtotal, discount_amount, tax_amount, grand_total, status)</w:t>
+              <w:t xml:space="preserve">    9. MENU_CATEGORY (category_id [PK], name [UQ], description)</w:t>
               <w:br/>
-              <w:t xml:space="preserve">    10. PAYMENT(payment_id [PK], bill_id [FK], payment_method, amount, status, transaction_ref, processed_at)</w:t>
+              <w:t xml:space="preserve">    10. MENU_ITEM (item_id [PK], category_id [FK-&gt;MENU_CATEGORY.category_id], name, description, current_price, is_active, image_url, created_at, updated_at)</w:t>
+              <w:br/>
+              <w:t xml:space="preserve">    11. CUSTOMER_ORDER (order_id [PK], session_id [FK-&gt;DINING_SESSION.session_id], user_id [FK-&gt;USER_ACCOUNT.user_id], status, created_at, updated_at)</w:t>
+              <w:br/>
+              <w:t xml:space="preserve">    12. ORDER_ITEM (order_item_id [PK], order_id [FK-&gt;CUSTOMER_ORDER.order_id], item_id [FK-&gt;MENU_ITEM.item_id], quantity, unit_price, special_requests, created_at, updated_at)</w:t>
+              <w:br/>
+              <w:t xml:space="preserve">    13. ORDER_STATUS_HISTORY (history_id [PK], order_id [FK-&gt;CUSTOMER_ORDER.order_id], status, changed_at)</w:t>
+              <w:br/>
+              <w:t xml:space="preserve">    14. KITCHEN_TICKET (ticket_id [PK], order_id [FK-&gt;CUSTOMER_ORDER.order_id], status, prep_start_time, ready_time, created_at, updated_at)</w:t>
+              <w:br/>
+              <w:t xml:space="preserve">    15. KITCHEN_TICKET_ITEM (ticket_item_id [PK], ticket_id [FK-&gt;KITCHEN_TICKET.ticket_id], order_item_id [FK-&gt;ORDER_ITEM.order_item_id], status)</w:t>
+              <w:br/>
+              <w:t xml:space="preserve">    16. BILL (bill_id [PK], session_id [FK-&gt;DINING_SESSION.session_id], subtotal, tax_amount, total_amount, status, created_at, updated_at)</w:t>
+              <w:br/>
+              <w:t xml:space="preserve">    17. BILL_ITEM (bill_item_id [PK], bill_id [FK-&gt;BILL.bill_id], order_item_id [FK-&gt;ORDER_ITEM.order_item_id], item_name_snapshot, quantity, total_price)</w:t>
+              <w:br/>
+              <w:t xml:space="preserve">    18. DISCOUNT (discount_id [PK], code [UQ], discount_type, percentage_off, fixed_amount_off, is_active)</w:t>
+              <w:br/>
+              <w:t xml:space="preserve">    19. DISCOUNT_APPLICATION (discount_app_id [PK], bill_id [FK-&gt;BILL.bill_id], discount_id [FK-&gt;DISCOUNT.discount_id], authorized_by [FK-&gt;USER_ACCOUNT.user_id], applied_amount)</w:t>
+              <w:br/>
+              <w:t xml:space="preserve">    20. PAYMENT (payment_id [PK], bill_id [FK-&gt;BILL.bill_id], amount, payment_method, status, transaction_ref [UQ], created_at, updated_at)</w:t>
             </w:r>
           </w:p>
         </w:tc>

</xml_diff>